<commit_message>
Reemplazar fuente sobre cosmovisión amazónica en el informe de la práctica 2
Co-Authored-By: Claude Sonnet 5.5 <noreply@anthropic.com>
Claude-Session: https://claude.ai/code/session_01ELiiEMNxLSZU1C1isiGyKM
</commit_message>
<xml_diff>
--- a/deber2_antropologia/Informe_Practica2_Antropologia.docx
+++ b/deber2_antropologia/Informe_Practica2_Antropologia.docx
@@ -697,27 +697,7 @@
                 <w:szCs w:val="22"/>
                 <w:lang w:val="es-EC"/>
               </w:rPr>
-              <w:t xml:space="preserve"> se ha construido como una propuesta de resistencia sociopolítica frente a la hegemonía neoliberal y al desarrollismo extractivista, y como un desafío epistémico, pues el Ecuador adoptó los derechos de la naturaleza y se definió como plurinacional por primera vez en su historia (Piñeiro Aguiar &amp; Polo Blanco, 2021). En la Amazonía, un estudio cualitativo identificó cuatro elementos constitutivos del </w:t>
-            </w:r>
-            <w:r>
-              <w:rPr>
-                <w:rFonts w:ascii="Arial" w:hAnsi="Arial" w:cs="Arial" w:eastAsia="Arial"/>
-                <w:i/>
-                <w:iCs/>
-                <w:sz w:val="22"/>
-                <w:szCs w:val="22"/>
-                <w:lang w:val="es-EC"/>
-              </w:rPr>
-              <w:t xml:space="preserve">sumak kawsay</w:t>
-            </w:r>
-            <w:r>
-              <w:rPr>
-                <w:rFonts w:ascii="Arial" w:hAnsi="Arial" w:cs="Arial" w:eastAsia="Arial"/>
-                <w:sz w:val="22"/>
-                <w:szCs w:val="22"/>
-                <w:lang w:val="es-EC"/>
-              </w:rPr>
-              <w:t xml:space="preserve">: una cosmovisión indígena centrada en la naturaleza, la comunidad, una economía basada en la solidaridad y el conocimiento ancestral (Coral-Guerrero et al., 2021).</w:t>
+              <w:t xml:space="preserve"> se ha construido como una propuesta de resistencia sociopolítica frente a la hegemonía neoliberal y al desarrollismo extractivista, y como un desafío epistémico, pues el Ecuador adoptó los derechos de la naturaleza y se definió como plurinacional por primera vez en su historia (Piñeiro Aguiar &amp; Polo Blanco, 2021). En la Amazonía, la cosmovisión kichwa se refleja en experiencias como la del Grupo chakra de Archidona (Napo), un sistema agroforestal que toma la sabiduría del pueblo kichwa amazónico y busca generar ingresos de manera limpia y responsable con el medio ambiente (Echezuría Fernández, 2023).</w:t>
             </w:r>
           </w:p>
           <w:p>
@@ -1600,7 +1580,7 @@
                 <w:szCs w:val="22"/>
                 <w:lang w:val="es-EC"/>
               </w:rPr>
-              <w:t xml:space="preserve">. Las fuentes académicas citadas respaldan el sentido del </w:t>
+              <w:t xml:space="preserve">. Las fuentes académicas citadas respaldan la cosmovisión andina, vista desde el </w:t>
             </w:r>
             <w:r>
               <w:rPr>
@@ -1620,7 +1600,27 @@
                 <w:szCs w:val="22"/>
                 <w:lang w:val="es-EC"/>
               </w:rPr>
-              <w:t xml:space="preserve"> en ambos contextos (Coral-Guerrero et al., 2021; Piñeiro Aguiar &amp; Polo Blanco, 2021).</w:t>
+              <w:t xml:space="preserve"> (Piñeiro Aguiar &amp; Polo Blanco, 2021), y la amazónica, vista desde la chacra o </w:t>
+            </w:r>
+            <w:r>
+              <w:rPr>
+                <w:rFonts w:ascii="Arial" w:hAnsi="Arial" w:cs="Arial" w:eastAsia="Arial"/>
+                <w:i/>
+                <w:iCs/>
+                <w:sz w:val="22"/>
+                <w:szCs w:val="22"/>
+                <w:lang w:val="es-EC"/>
+              </w:rPr>
+              <w:t xml:space="preserve">chakra</w:t>
+            </w:r>
+            <w:r>
+              <w:rPr>
+                <w:rFonts w:ascii="Arial" w:hAnsi="Arial" w:cs="Arial" w:eastAsia="Arial"/>
+                <w:sz w:val="22"/>
+                <w:szCs w:val="22"/>
+                <w:lang w:val="es-EC"/>
+              </w:rPr>
+              <w:t xml:space="preserve"> kichwa (Echezuría Fernández, 2023).</w:t>
             </w:r>
           </w:p>
           <w:p>
@@ -2125,7 +2125,7 @@
                 <w:szCs w:val="22"/>
                 <w:lang w:val="es-EC"/>
               </w:rPr>
-              <w:t xml:space="preserve">Coral-Guerrero, C. A., García-Quero, F., &amp; Guardiola, J. (2021). What is sumak kawsay? A qualitative study in the Ecuadorian Amazon. </w:t>
+              <w:t xml:space="preserve">Echezuría Fernández, C. (2023). Cosmovisión kichwa, sistemas agroforestales y alternativas sustentables para la Amazonía. La experiencia del Grupo chakra en Archidona, Ecuador. </w:t>
             </w:r>
             <w:r>
               <w:rPr>
@@ -2136,36 +2136,16 @@
                 <w:szCs w:val="22"/>
                 <w:lang w:val="es-EC"/>
               </w:rPr>
-              <w:t xml:space="preserve">Latin American Perspectives</w:t>
-            </w:r>
-            <w:r>
-              <w:rPr>
-                <w:rFonts w:ascii="Arial" w:hAnsi="Arial" w:cs="Arial" w:eastAsia="Arial"/>
-                <w:sz w:val="22"/>
-                <w:szCs w:val="22"/>
-                <w:lang w:val="es-EC"/>
-              </w:rPr>
-              <w:t xml:space="preserve">, </w:t>
-            </w:r>
-            <w:r>
-              <w:rPr>
-                <w:rFonts w:ascii="Arial" w:hAnsi="Arial" w:cs="Arial" w:eastAsia="Arial"/>
-                <w:i/>
-                <w:iCs/>
-                <w:sz w:val="22"/>
-                <w:szCs w:val="22"/>
-                <w:lang w:val="es-EC"/>
-              </w:rPr>
-              <w:t xml:space="preserve">48</w:t>
-            </w:r>
-            <w:r>
-              <w:rPr>
-                <w:rFonts w:ascii="Arial" w:hAnsi="Arial" w:cs="Arial" w:eastAsia="Arial"/>
-                <w:sz w:val="22"/>
-                <w:szCs w:val="22"/>
-                <w:lang w:val="es-EC"/>
-              </w:rPr>
-              <w:t xml:space="preserve">(3), 35–50. https://doi.org/10.1177/0094582X211004913</w:t>
+              <w:t xml:space="preserve">Entorno Geográfico</w:t>
+            </w:r>
+            <w:r>
+              <w:rPr>
+                <w:rFonts w:ascii="Arial" w:hAnsi="Arial" w:cs="Arial" w:eastAsia="Arial"/>
+                <w:sz w:val="22"/>
+                <w:szCs w:val="22"/>
+                <w:lang w:val="es-EC"/>
+              </w:rPr>
+              <w:t xml:space="preserve">, (25), e21912613. https://doi.org/10.25100/eg.v0i25.12613</w:t>
             </w:r>
           </w:p>
           <w:p>
@@ -2427,7 +2407,7 @@
                 <w:szCs w:val="22"/>
                 <w:lang w:val="es-EC"/>
               </w:rPr>
-              <w:t xml:space="preserve">• Coral-Guerrero et al. (2021): https://doi.org/10.1177/0094582X211004913</w:t>
+              <w:t xml:space="preserve">• Echezuría Fernández (2023): https://doi.org/10.25100/eg.v0i25.12613</w:t>
             </w:r>
           </w:p>
           <w:p>

</xml_diff>